<commit_message>
The school-clock sweep: 16 residues across 8 sessions converted to the evening clock (John caught 5:03 in S6); S1/S12/S14 closing choreography held for a call; changelog v2.9
Co-Authored-By: Claude Fable 5 <noreply@anthropic.com>
</commit_message>
<xml_diff>
--- a/_implementation-notes/evening-series/FotH Evening Session 17 Leader Notes DRAFT v1.docx
+++ b/_implementation-notes/evening-series/FotH Evening Session 17 Leader Notes DRAFT v1.docx
@@ -268,7 +268,7 @@
         <w:t>BEATS:</w:t>
       </w:r>
       <w:r>
-        <w:t xml:space="preserve"> 1. Bless, then say the reframe once, warmly: we lost [date] to [cause]; this afternoon exists in the calendar for exactly this — today IS [session name], whole, not a make-up. Nothing was skipped; it just moved. 2. At 4:20 hand the room to the lifted plan — its blocks, scripts, splits, and watch-fors run from its own run sheet, prepped via the lift checklist at the prep meeting. 3. Today's constants resume at 5:13: the break practice, the feedback round, the close.</w:t>
+        <w:t xml:space="preserve"> 1. Bless, then say the reframe once, warmly: we lost [date] to [cause]; this afternoon exists in the calendar for exactly this — today IS [session name], whole, not a make-up. Nothing was skipped; it just moved. 2. At 7:27 hand the room to the lifted plan — its blocks, scripts, splits, and watch-fors run from its own run sheet, prepped via the lift checklist at the prep meeting. 3. Today's constants resume at 7:50: the break practice, the feedback round, the close.</w:t>
       </w:r>
     </w:p>
     <w:p>
@@ -342,7 +342,7 @@
         <w:t>BEATS:</w:t>
       </w:r>
       <w:r>
-        <w:t xml:space="preserve"> 1. Open: container, one word — we lost nothing this quarter; today we walk the real cards, not the ideal ones. 2. Proverbs 16:9, short: we planned the way; the LORD established the steps. 3. Leaders walk FIRST (4:28–4:38), genuinely slipped cards — the session stands on this; open with the slip. 4. The room walks (4:38–5:13): 2–3 min each, daily/weekly/monthly as lived; troubleshoot one minute only when invited; listen like a thief.</w:t>
+        <w:t xml:space="preserve"> 1. Open: container, one word — we lost nothing this quarter; today we walk the real cards, not the ideal ones. 2. Proverbs 16:9, short: we planned the way; the LORD established the steps. 3. Leaders walk FIRST (7:59–8:03), genuinely slipped cards — the session stands on this; open with the slip. 4. The room walks (8:03–8:18): 2–3 min each, daily/weekly/monthly as lived; troubleshoot one minute only when invited; listen like a thief.</w:t>
       </w:r>
     </w:p>
     <w:p>

</xml_diff>